<commit_message>
fix(data): cap nhat dap an va noi dung cau 25 bai 6 theo giao trinh
</commit_message>
<xml_diff>
--- a/CHỦ NGHĨA XÃ HỘI KHOA HỌC - BÀI 6.docx
+++ b/CHỦ NGHĨA XÃ HỘI KHOA HỌC - BÀI 6.docx
@@ -3170,24 +3170,7 @@
         </w:rPr>
       </w:pPr>
       <w:r>
-        <w:rPr>
-          <w:rFonts w:ascii="Times New Roman" w:eastAsia="Times New Roman" w:hAnsi="Times New Roman" w:cs="Times New Roman"/>
-          <w:b/>
-          <w:bCs/>
-          <w:color w:val="1F1F1F"/>
-          <w:sz w:val="24"/>
-          <w:szCs w:val="24"/>
-        </w:rPr>
-        <w:t xml:space="preserve">Câu 25: </w:t>
-      </w:r>
-      <w:r>
-        <w:rPr>
-          <w:rFonts w:ascii="Times New Roman" w:eastAsia="Times New Roman" w:hAnsi="Times New Roman" w:cs="Times New Roman"/>
-          <w:color w:val="1F1F1F"/>
-          <w:sz w:val="24"/>
-          <w:szCs w:val="24"/>
-        </w:rPr>
-        <w:t>Chọn đáp án (Đúng hoặc Sai) với từng phát biểu sau:</w:t>
+        <w:t>Câu 25: Chọn đáp án Đúng hoặc Sai đối với các phát biểu sau về chức năng và quan hệ gia đình Việt Nam hiện nay:</w:t>
       </w:r>
     </w:p>
     <w:p>
@@ -3211,13 +3194,7 @@
         </w:rPr>
       </w:pPr>
       <w:r>
-        <w:rPr>
-          <w:rFonts w:ascii="Times New Roman" w:eastAsia="Times New Roman" w:hAnsi="Times New Roman" w:cs="Times New Roman"/>
-          <w:color w:val="1F1F1F"/>
-          <w:sz w:val="24"/>
-          <w:szCs w:val="24"/>
-        </w:rPr>
-        <w:t>1. Nội dung giáo dục trong gia đình hiện nay chỉ tập trung giáo dục đạo đức</w:t>
+        <w:t>1. Hiện nay, kinh tế gia đình đang trở thành một bộ phận quan trọng trong nền kinh tế quốc dân</w:t>
       </w:r>
     </w:p>
     <w:p>
@@ -3231,12 +3208,63 @@
         </w:rPr>
       </w:pPr>
       <w:r>
-        <w:rPr>
-          <w:rFonts w:ascii="Times New Roman" w:eastAsia="Times New Roman" w:hAnsi="Times New Roman" w:cs="Times New Roman"/>
-          <w:color w:val="FF0000"/>
-          <w:sz w:val="24"/>
-          <w:szCs w:val="24"/>
-        </w:rPr>
+        <w:t>Đúng</w:t>
+      </w:r>
+    </w:p>
+    <w:p>
+      <w:pPr>
+        <w:spacing w:after="240"/>
+        <w:rPr>
+          <w:rFonts w:ascii="Times New Roman" w:eastAsia="Times New Roman" w:hAnsi="Times New Roman" w:cs="Times New Roman"/>
+          <w:color w:val="1F1F1F"/>
+          <w:sz w:val="24"/>
+          <w:szCs w:val="24"/>
+        </w:rPr>
+      </w:pPr>
+      <w:r>
+        <w:t>2. Điểm tương đồng giữa giáo dục gia đình truyền thống và giáo dục của xã hội mới là tiếp tục nhấn mạnh sự hy sinh của cá nhân cho cộng đồng</w:t>
+      </w:r>
+    </w:p>
+    <w:p>
+      <w:pPr>
+        <w:spacing w:after="240"/>
+        <w:rPr>
+          <w:rFonts w:ascii="Times New Roman" w:eastAsia="Times New Roman" w:hAnsi="Times New Roman" w:cs="Times New Roman"/>
+          <w:color w:val="FF0000"/>
+          <w:sz w:val="24"/>
+          <w:szCs w:val="24"/>
+        </w:rPr>
+      </w:pPr>
+      <w:r>
+        <w:t>Đúng</w:t>
+      </w:r>
+    </w:p>
+    <w:p>
+      <w:pPr>
+        <w:spacing w:after="240"/>
+        <w:rPr>
+          <w:rFonts w:ascii="Times New Roman" w:eastAsia="Times New Roman" w:hAnsi="Times New Roman" w:cs="Times New Roman"/>
+          <w:color w:val="1F1F1F"/>
+          <w:sz w:val="24"/>
+          <w:szCs w:val="24"/>
+        </w:rPr>
+      </w:pPr>
+      <w:r>
+        <w:t>3. Hiện nay, độ bền vững của gia đình không bị chi phối bởi các mối quan hệ hòa hợp tình cảm giữa chồng và vợ, cha mẹ và con cái</w:t>
+      </w:r>
+    </w:p>
+    <w:p>
+      <w:pPr>
+        <w:spacing w:after="240"/>
+        <w:rPr>
+          <w:rFonts w:ascii="Times New Roman" w:eastAsia="Times New Roman" w:hAnsi="Times New Roman" w:cs="Times New Roman"/>
+          <w:color w:val="1F1F1F"/>
+          <w:sz w:val="24"/>
+          <w:szCs w:val="24"/>
+          <w:lang w:val="en-US"/>
+        </w:rPr>
+      </w:pPr>
+      <w:r>
         <w:t>Sai</w:t>
       </w:r>
     </w:p>
@@ -3251,98 +3279,7 @@
         </w:rPr>
       </w:pPr>
       <w:r>
-        <w:rPr>
-          <w:rFonts w:ascii="Times New Roman" w:eastAsia="Times New Roman" w:hAnsi="Times New Roman" w:cs="Times New Roman"/>
-          <w:color w:val="1F1F1F"/>
-          <w:sz w:val="24"/>
-          <w:szCs w:val="24"/>
-        </w:rPr>
-        <w:t>2. Hiện nay, độ bền vững của gia đình không bị chi phối bởi các mối quan hệ hòa hợp tình cảm giữa chồng và vợ, cha mẹ và con cái</w:t>
-      </w:r>
-    </w:p>
-    <w:p>
-      <w:pPr>
-        <w:spacing w:after="240"/>
-        <w:rPr>
-          <w:rFonts w:ascii="Times New Roman" w:eastAsia="Times New Roman" w:hAnsi="Times New Roman" w:cs="Times New Roman"/>
-          <w:color w:val="FF0000"/>
-          <w:sz w:val="24"/>
-          <w:szCs w:val="24"/>
-        </w:rPr>
-      </w:pPr>
-      <w:r>
-        <w:rPr>
-          <w:rFonts w:ascii="Times New Roman" w:eastAsia="Times New Roman" w:hAnsi="Times New Roman" w:cs="Times New Roman"/>
-          <w:color w:val="FF0000"/>
-          <w:sz w:val="24"/>
-          <w:szCs w:val="24"/>
-        </w:rPr>
-        <w:t>Sai</w:t>
-      </w:r>
-    </w:p>
-    <w:p>
-      <w:pPr>
-        <w:spacing w:after="240"/>
-        <w:rPr>
-          <w:rFonts w:ascii="Times New Roman" w:eastAsia="Times New Roman" w:hAnsi="Times New Roman" w:cs="Times New Roman"/>
-          <w:color w:val="1F1F1F"/>
-          <w:sz w:val="24"/>
-          <w:szCs w:val="24"/>
-        </w:rPr>
-      </w:pPr>
-      <w:r>
-        <w:rPr>
-          <w:rFonts w:ascii="Times New Roman" w:eastAsia="Times New Roman" w:hAnsi="Times New Roman" w:cs="Times New Roman"/>
-          <w:color w:val="1F1F1F"/>
-          <w:sz w:val="24"/>
-          <w:szCs w:val="24"/>
-        </w:rPr>
-        <w:t>3. Giáo dục gia đình tiếp tục nhấn mạnh sự hy sinh của cá nhân cho cộng đồng</w:t>
-      </w:r>
-    </w:p>
-    <w:p>
-      <w:pPr>
-        <w:spacing w:after="240"/>
-        <w:rPr>
-          <w:rFonts w:ascii="Times New Roman" w:eastAsia="Times New Roman" w:hAnsi="Times New Roman" w:cs="Times New Roman"/>
-          <w:color w:val="1F1F1F"/>
-          <w:sz w:val="24"/>
-          <w:szCs w:val="24"/>
-          <w:lang w:val="en-US"/>
-        </w:rPr>
-      </w:pPr>
-      <w:proofErr w:type="spellStart"/>
-      <w:r>
-        <w:rPr>
-          <w:rFonts w:ascii="Times New Roman" w:eastAsia="Times New Roman" w:hAnsi="Times New Roman" w:cs="Times New Roman"/>
-          <w:color w:val="FF0000"/>
-          <w:sz w:val="24"/>
-          <w:szCs w:val="24"/>
-          <w:lang w:val="en-US"/>
-        </w:rPr>
-        <w:lastRenderedPageBreak/>
-        <w:t>Đúng</w:t>
-      </w:r>
-      <w:proofErr w:type="spellEnd"/>
-    </w:p>
-    <w:p>
-      <w:pPr>
-        <w:spacing w:after="240"/>
-        <w:rPr>
-          <w:rFonts w:ascii="Times New Roman" w:eastAsia="Times New Roman" w:hAnsi="Times New Roman" w:cs="Times New Roman"/>
-          <w:color w:val="1F1F1F"/>
-          <w:sz w:val="24"/>
-          <w:szCs w:val="24"/>
-        </w:rPr>
-      </w:pPr>
-      <w:r>
-        <w:rPr>
-          <w:rFonts w:ascii="Times New Roman" w:eastAsia="Times New Roman" w:hAnsi="Times New Roman" w:cs="Times New Roman"/>
-          <w:color w:val="1F1F1F"/>
-          <w:sz w:val="24"/>
-          <w:szCs w:val="24"/>
-        </w:rPr>
-        <w:t>4. Hiện nay, kinh tế gia đình đang trở thành một bộ phận quan trọng trong nền kinh tế quốc dân</w:t>
+        <w:t>4. Nội dung giáo dục trong gia đình hiện nay chỉ tập trung giáo dục đạo đức</w:t>
       </w:r>
     </w:p>
     <w:p>
@@ -3358,13 +3295,7 @@
         </w:rPr>
       </w:pPr>
       <w:r>
-        <w:rPr>
-          <w:rFonts w:ascii="Times New Roman" w:eastAsia="Times New Roman" w:hAnsi="Times New Roman" w:cs="Times New Roman"/>
-          <w:color w:val="FF0000"/>
-          <w:sz w:val="24"/>
-          <w:szCs w:val="24"/>
-        </w:rPr>
-        <w:t>Đúng</w:t>
+        <w:t>Sai</w:t>
       </w:r>
     </w:p>
     <w:p>

</xml_diff>